<commit_message>
10/07 LIVE: fix wrong B1 TikTok link, pin B2, caption-check A1
B1 shipped as .../7523672986004606238, which has an empty caption and was
chosen on account + ID date alone. The producer caught it. The right post is
.../7392239491588705579 (July 16, 2024), confirmed by its own caption and by
the Daily Dot article the source log cites.

B2 is now pinned via the Daily Dot embed (.../7392290262262828318; account
renamed @jaymes.png). A1 re-checked by caption match against The Mary Sue's
embed and holds.

Corrects the yield-log pattern that caused this: a TikTok ID's embedded date
can rule a post out, never in. Native links are now checked against their
oEmbed caption before shipping. Flags two B1 script lines ("about 25 items",
"screenshot of every single price") that no source supports.

Co-Authored-By: Claude Opus 5.5 <noreply@anthropic.com>
Claude-Session: https://claude.ai/code/session_01B8fDvQoDNULdzmUZFQ5q34
</commit_message>
<xml_diff>
--- a/runs/LIVE_10072026/10_07_LIVE_BIBLE_-_YOUR_STORE_IS_WATCHING_YOU_FILLED.docx
+++ b/runs/LIVE_10072026/10_07_LIVE_BIBLE_-_YOUR_STORE_IS_WATCHING_YOU_FILLED.docx
@@ -6065,7 +6065,7 @@
           <w:color w:val="1155CC"/>
           <w:sz w:val="36"/>
         </w:rPr>
-        <w:t xml:space="preserve">Katelyn Montalbano's short video (@kb.montalbano)  —  </w:t>
+        <w:t xml:space="preserve">Katelyn Montalbano (@kb.montalbano) — Prime Day cart video, July 16, 2024  —  </w:t>
       </w:r>
       <w:hyperlink r:id="rIdClip7">
         <w:r>
@@ -6076,7 +6076,7 @@
             <w:u w:val="single"/>
             <w:sz w:val="36"/>
           </w:rPr>
-          <w:t xml:space="preserve">https://www.tiktok.com/@kb.montalbano/video/7523672986004606238</w:t>
+          <w:t xml:space="preserve">https://www.tiktok.com/@kb.montalbano/video/7392239491588705579</w:t>
         </w:r>
       </w:hyperlink>
     </w:p>
@@ -6102,6 +6102,48 @@
         <w:rPr>
           <w:rFonts w:ascii="Arial" w:hAnsi="Arial" w:cs="Arial" w:eastAsia="Arial"/>
           <w:b w:val="0"/>
+          <w:color w:val="B7791F"/>
+          <w:sz w:val="36"/>
+        </w:rPr>
+        <w:t xml:space="preserve">NOTE: 2024 video — keep it off any 'this week' line</w:t>
+      </w:r>
+    </w:p>
+    <w:p>
+      <w:pPr>
+        <w:spacing w:lineRule="auto" w:line="276" w:before="0" w:after="0"/>
+      </w:pPr>
+      <w:r>
+        <w:rPr>
+          <w:rFonts w:ascii="Arial" w:hAnsi="Arial" w:cs="Arial" w:eastAsia="Arial"/>
+          <w:b w:val="0"/>
+          <w:color w:val="B7791F"/>
+          <w:sz w:val="36"/>
+        </w:rPr>
+        <w:t xml:space="preserve">NOTE: script says 'about 25 items' and 'a screenshot of every single price' — neither appears in her caption or the Daily Dot write-up; verify or soften</w:t>
+      </w:r>
+    </w:p>
+    <w:p>
+      <w:pPr>
+        <w:spacing w:lineRule="auto" w:line="276" w:before="0" w:after="0"/>
+      </w:pPr>
+      <w:r>
+        <w:rPr>
+          <w:rFonts w:ascii="Arial" w:hAnsi="Arial" w:cs="Arial" w:eastAsia="Arial"/>
+          <w:b w:val="0"/>
+          <w:color w:val="B7791F"/>
+          <w:sz w:val="36"/>
+        </w:rPr>
+        <w:t xml:space="preserve">NOTE: the '$7' in the source log is a COMMENTER's line ('Amazon is messy! My cart went up $7!'), not hers — the script doesn't use it; keep it that way</w:t>
+      </w:r>
+    </w:p>
+    <w:p>
+      <w:pPr>
+        <w:spacing w:lineRule="auto" w:line="276" w:before="0" w:after="0"/>
+      </w:pPr>
+      <w:r>
+        <w:rPr>
+          <w:rFonts w:ascii="Arial" w:hAnsi="Arial" w:cs="Arial" w:eastAsia="Arial"/>
+          <w:b w:val="0"/>
           <w:color w:val="000000"/>
           <w:sz w:val="36"/>
         </w:rPr>
@@ -6394,7 +6436,7 @@
           <w:color w:val="1155CC"/>
           <w:sz w:val="36"/>
         </w:rPr>
-        <w:t xml:space="preserve">Jaymes (@semyajnotsemaj) — Prime Day fake-discount video, July 2024  —  </w:t>
+        <w:t xml:space="preserve">Jaymes (@jaymes.png, formerly @semyajnotsemaj) — 'WATCH OUT FOR SCAMS ON AMAZON!', July 16, 2024  —  </w:t>
       </w:r>
       <w:hyperlink r:id="rIdClip8">
         <w:r>
@@ -6405,7 +6447,7 @@
             <w:u w:val="single"/>
             <w:sz w:val="36"/>
           </w:rPr>
-          <w:t xml:space="preserve">https://www.tiktok.com/@semyajnotsemaj</w:t>
+          <w:t xml:space="preserve">https://www.tiktok.com/@semyajnotsemaj/video/7392290262262828318</w:t>
         </w:r>
       </w:hyperlink>
     </w:p>
@@ -6420,7 +6462,35 @@
           <w:color w:val="B7791F"/>
           <w:sz w:val="36"/>
         </w:rPr>
-        <w:t xml:space="preserve">PERMALINK NOT PINNED — profile only. Scroll to the dated post. No timecode invented.</w:t>
+        <w:t xml:space="preserve">OUTCUE UNVERIFIED — native TikTok post, no caption track. Not watched. Producer sets IN/OUT by eye. No timecode invented.</w:t>
+      </w:r>
+    </w:p>
+    <w:p>
+      <w:pPr>
+        <w:spacing w:lineRule="auto" w:line="276" w:before="0" w:after="0"/>
+      </w:pPr>
+      <w:r>
+        <w:rPr>
+          <w:rFonts w:ascii="Arial" w:hAnsi="Arial" w:cs="Arial" w:eastAsia="Arial"/>
+          <w:b w:val="0"/>
+          <w:color w:val="B7791F"/>
+          <w:sz w:val="36"/>
+        </w:rPr>
+        <w:t xml:space="preserve">NOTE: 2024 video</w:t>
+      </w:r>
+    </w:p>
+    <w:p>
+      <w:pPr>
+        <w:spacing w:lineRule="auto" w:line="276" w:before="0" w:after="0"/>
+      </w:pPr>
+      <w:r>
+        <w:rPr>
+          <w:rFonts w:ascii="Arial" w:hAnsi="Arial" w:cs="Arial" w:eastAsia="Arial"/>
+          <w:b w:val="0"/>
+          <w:color w:val="B7791F"/>
+          <w:sz w:val="36"/>
+        </w:rPr>
+        <w:t xml:space="preserve">NOTE: account renamed to @jaymes.png — credit the current handle on air</w:t>
       </w:r>
     </w:p>
     <w:p>

</xml_diff>

<commit_message>
10/07 LIVE: YouTube block lifted — A2, A3, A5 graded with verified segments
A later probe got through, so captions were fetched for the three throttled
beats (top candidates first, probing before each fetch and stopping when the
bot check returned).

A5: Eric Gardner on the full 437-shopper results, 4:05-4:53. The earlier
pilot segment was avoided because its egg prices contradict the script.
A2: NBC Connecticut on plate readers at Lowe's/Home Depot, two segments.
A3: Instacart's own Caper Cart video, horizontal on a vertical b-roll marker
(needs a crop; no captioned vertical cart footage exists).

7 verified segments across 4 beats; the 3 TikTok beats stay manual lane.

Co-Authored-By: Claude Opus 5.5 <noreply@anthropic.com>
Claude-Session: https://claude.ai/code/session_01B8fDvQoDNULdzmUZFQ5q34
</commit_message>
<xml_diff>
--- a/runs/LIVE_10072026/10_07_LIVE_BIBLE_-_YOUR_STORE_IS_WATCHING_YOU_FILLED.docx
+++ b/runs/LIVE_10072026/10_07_LIVE_BIBLE_-_YOUR_STORE_IS_WATCHING_YOU_FILLED.docx
@@ -1503,24 +1503,24 @@
         <w:rPr>
           <w:rFonts w:ascii="Arial" w:hAnsi="Arial" w:cs="Arial" w:eastAsia="Arial"/>
           <w:b/>
-          <w:color w:val="B7791F"/>
-          <w:sz w:val="36"/>
-        </w:rPr>
-        <w:t xml:space="preserve">L07-A2 — authority_report / horizontal  ·  PENDING CAPTIONS — YOUTUBE BLOCKED THIS RUN</w:t>
-      </w:r>
-    </w:p>
-    <w:p>
-      <w:pPr>
-        <w:spacing w:lineRule="auto" w:line="276" w:before="0" w:after="0"/>
-      </w:pPr>
-      <w:r>
-        <w:rPr>
-          <w:rFonts w:ascii="Arial" w:hAnsi="Arial" w:cs="Arial" w:eastAsia="Arial"/>
-          <w:b w:val="0"/>
-          <w:color w:val="B7791F"/>
-          <w:sz w:val="36"/>
-        </w:rPr>
-        <w:t xml:space="preserve">Top candidate:  </w:t>
+          <w:color w:val="1155CC"/>
+          <w:sz w:val="36"/>
+        </w:rPr>
+        <w:t xml:space="preserve">L07-A2 — authority_report / horizontal</w:t>
+      </w:r>
+    </w:p>
+    <w:p>
+      <w:pPr>
+        <w:spacing w:lineRule="auto" w:line="276" w:before="0" w:after="0"/>
+      </w:pPr>
+      <w:r>
+        <w:rPr>
+          <w:rFonts w:ascii="Arial" w:hAnsi="Arial" w:cs="Arial" w:eastAsia="Arial"/>
+          <w:b w:val="0"/>
+          <w:color w:val="1155CC"/>
+          <w:sz w:val="36"/>
+        </w:rPr>
+        <w:t xml:space="preserve">License plate readers now at Home Depot, Lowe's Home Improvement stores (NBC Connecticut)  —  </w:t>
       </w:r>
       <w:hyperlink r:id="rIdClip2">
         <w:r>
@@ -1542,11 +1542,401 @@
       <w:r>
         <w:rPr>
           <w:rFonts w:ascii="Arial" w:hAnsi="Arial" w:cs="Arial" w:eastAsia="Arial"/>
+          <w:b/>
+          <w:color w:val="1155CC"/>
+          <w:sz w:val="36"/>
+        </w:rPr>
+        <w:t xml:space="preserve">IN 0:17 – OUT 0:51</w:t>
+      </w:r>
+      <w:r>
+        <w:rPr>
+          <w:rFonts w:ascii="Arial" w:hAnsi="Arial" w:cs="Arial" w:eastAsia="Arial"/>
+          <w:b w:val="0"/>
+          <w:color w:val="1155CC"/>
+          <w:sz w:val="36"/>
+        </w:rPr>
+        <w:t xml:space="preserve">   OUTCUE: “now using them to prevent theft. It's an”</w:t>
+      </w:r>
+    </w:p>
+    <w:p>
+      <w:pPr>
+        <w:spacing w:lineRule="auto" w:line="276" w:before="0" w:after="0"/>
+      </w:pPr>
+      <w:r>
+        <w:rPr>
+          <w:rFonts w:ascii="Arial" w:hAnsi="Arial" w:cs="Arial" w:eastAsia="Arial"/>
+          <w:b/>
+          <w:color w:val="1155CC"/>
+          <w:sz w:val="36"/>
+        </w:rPr>
+        <w:t xml:space="preserve">IN 1:22 – OUT 1:37</w:t>
+      </w:r>
+      <w:r>
+        <w:rPr>
+          <w:rFonts w:ascii="Arial" w:hAnsi="Arial" w:cs="Arial" w:eastAsia="Arial"/>
+          <w:b w:val="0"/>
+          <w:color w:val="1155CC"/>
+          <w:sz w:val="36"/>
+        </w:rPr>
+        <w:t xml:space="preserve">   OUTCUE: “accountability, data retention.”</w:t>
+      </w:r>
+    </w:p>
+    <w:p>
+      <w:pPr>
+        <w:spacing w:lineRule="auto" w:line="276" w:before="0" w:after="0"/>
+      </w:pPr>
+      <w:r>
+        <w:rPr>
+          <w:rFonts w:ascii="Arial" w:hAnsi="Arial" w:cs="Arial" w:eastAsia="Arial"/>
           <w:b w:val="0"/>
           <w:color w:val="B7791F"/>
           <w:sz w:val="36"/>
         </w:rPr>
-        <w:t xml:space="preserve">Pull-now fallback (no captions):  </w:t>
+        <w:t xml:space="preserve">NOTE: segment 1 in-point catches the reporter toss ('NBC Connecticut's Jane Chaco shows us…') — trim to 0:21 if Jeff doesn't want it</w:t>
+      </w:r>
+    </w:p>
+    <w:p>
+      <w:pPr>
+        <w:spacing w:lineRule="auto" w:line="276" w:before="0" w:after="0"/>
+      </w:pPr>
+      <w:r>
+        <w:rPr>
+          <w:rFonts w:ascii="Arial" w:hAnsi="Arial" w:cs="Arial" w:eastAsia="Arial"/>
+          <w:b w:val="0"/>
+          <w:color w:val="B7791F"/>
+          <w:sz w:val="36"/>
+        </w:rPr>
+        <w:t xml:space="preserve">NOTE: the Texas-sheriff Flock line in the script is NOT in this package — it still needs its own source (the source log flags the NY Post piece)</w:t>
+      </w:r>
+    </w:p>
+    <w:p>
+      <w:pPr>
+        <w:spacing w:lineRule="auto" w:line="276" w:before="0" w:after="0"/>
+      </w:pPr>
+      <w:r>
+        <w:rPr>
+          <w:rFonts w:ascii="Arial" w:hAnsi="Arial" w:cs="Arial" w:eastAsia="Arial"/>
+          <w:b w:val="0"/>
+          <w:color w:val="000000"/>
+          <w:sz w:val="36"/>
+        </w:rPr>
+      </w:r>
+    </w:p>
+    <w:p>
+      <w:pPr>
+        <w:spacing w:lineRule="auto" w:line="276" w:before="0" w:after="0"/>
+      </w:pPr>
+      <w:r>
+        <w:rPr>
+          <w:rFonts w:ascii="Arial" w:hAnsi="Arial" w:cs="Arial" w:eastAsia="Arial"/>
+          <w:b/>
+          <w:color w:val="000000"/>
+          <w:sz w:val="46"/>
+        </w:rPr>
+        <w:t>NOW THE SHOPPING CART ITSELF HAS CAMERAS!!</w:t>
+      </w:r>
+    </w:p>
+    <w:p>
+      <w:pPr>
+        <w:spacing w:lineRule="auto" w:line="276" w:before="0" w:after="0"/>
+      </w:pPr>
+      <w:r>
+        <w:rPr>
+          <w:rFonts w:ascii="Arial" w:hAnsi="Arial" w:cs="Arial" w:eastAsia="Arial"/>
+          <w:b w:val="0"/>
+          <w:color w:val="000000"/>
+          <w:sz w:val="36"/>
+        </w:rPr>
+      </w:r>
+    </w:p>
+    <w:p>
+      <w:pPr>
+        <w:spacing w:lineRule="auto" w:line="276" w:before="0" w:after="0"/>
+      </w:pPr>
+      <w:r>
+        <w:rPr>
+          <w:rFonts w:ascii="Arial" w:hAnsi="Arial" w:cs="Arial" w:eastAsia="Arial"/>
+          <w:b w:val="0"/>
+          <w:color w:val="000000"/>
+          <w:sz w:val="36"/>
+        </w:rPr>
+        <w:t xml:space="preserve">-INSTACART MAKES A SMART SHOPPING CART CALLED THE </w:t>
+      </w:r>
+      <w:r>
+        <w:rPr>
+          <w:rFonts w:ascii="Arial" w:hAnsi="Arial" w:cs="Arial" w:eastAsia="Arial"/>
+          <w:b/>
+          <w:color w:val="000000"/>
+          <w:sz w:val="36"/>
+        </w:rPr>
+        <w:t>CAPER CART</w:t>
+      </w:r>
+      <w:r>
+        <w:rPr>
+          <w:rFonts w:ascii="Arial" w:hAnsi="Arial" w:cs="Arial" w:eastAsia="Arial"/>
+          <w:b w:val="0"/>
+          <w:color w:val="000000"/>
+          <w:sz w:val="36"/>
+        </w:rPr>
+        <w:t>.</w:t>
+      </w:r>
+    </w:p>
+    <w:p>
+      <w:pPr>
+        <w:spacing w:lineRule="auto" w:line="276" w:before="0" w:after="0"/>
+      </w:pPr>
+      <w:r>
+        <w:rPr>
+          <w:rFonts w:ascii="Arial" w:hAnsi="Arial" w:cs="Arial" w:eastAsia="Arial"/>
+          <w:b w:val="0"/>
+          <w:color w:val="000000"/>
+          <w:sz w:val="36"/>
+        </w:rPr>
+      </w:r>
+    </w:p>
+    <w:p>
+      <w:pPr>
+        <w:spacing w:lineRule="auto" w:line="276" w:before="0" w:after="0"/>
+      </w:pPr>
+      <w:r>
+        <w:rPr>
+          <w:rFonts w:ascii="Arial" w:hAnsi="Arial" w:cs="Arial" w:eastAsia="Arial"/>
+          <w:b w:val="0"/>
+          <w:color w:val="000000"/>
+          <w:sz w:val="36"/>
+        </w:rPr>
+        <w:t>-IT HAS CAMERAS POINTED INTO YOUR BASKET… CAMERAS POINTED OUT… AND A LOCATION-TRACKING SYSTEM.</w:t>
+      </w:r>
+    </w:p>
+    <w:p>
+      <w:pPr>
+        <w:spacing w:lineRule="auto" w:line="276" w:before="0" w:after="0"/>
+      </w:pPr>
+      <w:r>
+        <w:rPr>
+          <w:rFonts w:ascii="Arial" w:hAnsi="Arial" w:cs="Arial" w:eastAsia="Arial"/>
+          <w:b w:val="0"/>
+          <w:color w:val="000000"/>
+          <w:sz w:val="36"/>
+        </w:rPr>
+      </w:r>
+    </w:p>
+    <w:p>
+      <w:pPr>
+        <w:spacing w:lineRule="auto" w:line="276" w:before="0" w:after="0"/>
+      </w:pPr>
+      <w:r>
+        <w:rPr>
+          <w:rFonts w:ascii="Arial" w:hAnsi="Arial" w:cs="Arial" w:eastAsia="Arial"/>
+          <w:b w:val="0"/>
+          <w:color w:val="000000"/>
+          <w:sz w:val="36"/>
+        </w:rPr>
+        <w:t>-IT'S ALREADY ROLLING THROUGH STORES IN MORE THAN 100 CITIES IN 15 STATES.</w:t>
+      </w:r>
+    </w:p>
+    <w:p>
+      <w:pPr>
+        <w:spacing w:lineRule="auto" w:line="276" w:before="0" w:after="0"/>
+      </w:pPr>
+      <w:r>
+        <w:rPr>
+          <w:rFonts w:ascii="Arial" w:hAnsi="Arial" w:cs="Arial" w:eastAsia="Arial"/>
+          <w:b w:val="0"/>
+          <w:color w:val="000000"/>
+          <w:sz w:val="36"/>
+        </w:rPr>
+      </w:r>
+    </w:p>
+    <w:p>
+      <w:pPr>
+        <w:spacing w:lineRule="auto" w:line="276" w:before="0" w:after="0"/>
+      </w:pPr>
+      <w:r>
+        <w:rPr>
+          <w:rFonts w:ascii="Arial" w:hAnsi="Arial" w:cs="Arial" w:eastAsia="Arial"/>
+          <w:b w:val="0"/>
+          <w:color w:val="000000"/>
+          <w:sz w:val="36"/>
+        </w:rPr>
+        <w:t>-SHOPRITE, WEGMANS AND WEIS MARKETS ARE ALL USING THEM RIGHT NOW!</w:t>
+      </w:r>
+    </w:p>
+    <w:p>
+      <w:pPr>
+        <w:spacing w:lineRule="auto" w:line="276" w:before="0" w:after="0"/>
+      </w:pPr>
+      <w:r>
+        <w:rPr>
+          <w:rFonts w:ascii="Arial" w:hAnsi="Arial" w:cs="Arial" w:eastAsia="Arial"/>
+          <w:b w:val="0"/>
+          <w:color w:val="000000"/>
+          <w:sz w:val="36"/>
+        </w:rPr>
+      </w:r>
+    </w:p>
+    <w:p>
+      <w:pPr>
+        <w:spacing w:lineRule="auto" w:line="276" w:before="0" w:after="0"/>
+      </w:pPr>
+      <w:r>
+        <w:rPr>
+          <w:rFonts w:ascii="Arial" w:hAnsi="Arial" w:cs="Arial" w:eastAsia="Arial"/>
+          <w:b w:val="0"/>
+          <w:color w:val="000000"/>
+          <w:sz w:val="36"/>
+        </w:rPr>
+        <w:t>-THE CART KNOWS WHAT YOU PUT IN IT…</w:t>
+      </w:r>
+    </w:p>
+    <w:p>
+      <w:pPr>
+        <w:spacing w:lineRule="auto" w:line="276" w:before="0" w:after="0"/>
+      </w:pPr>
+      <w:r>
+        <w:rPr>
+          <w:rFonts w:ascii="Arial" w:hAnsi="Arial" w:cs="Arial" w:eastAsia="Arial"/>
+          <w:b w:val="0"/>
+          <w:color w:val="000000"/>
+          <w:sz w:val="36"/>
+        </w:rPr>
+      </w:r>
+    </w:p>
+    <w:p>
+      <w:pPr>
+        <w:spacing w:lineRule="auto" w:line="276" w:before="0" w:after="0"/>
+      </w:pPr>
+      <w:r>
+        <w:rPr>
+          <w:rFonts w:ascii="Arial" w:hAnsi="Arial" w:cs="Arial" w:eastAsia="Arial"/>
+          <w:b w:val="0"/>
+          <w:color w:val="000000"/>
+          <w:sz w:val="36"/>
+        </w:rPr>
+        <w:t>-AND IT PUTS ADS AND COUPONS ON THE SCREEN RIGHT IN FRONT OF YOU.</w:t>
+      </w:r>
+    </w:p>
+    <w:p>
+      <w:pPr>
+        <w:spacing w:lineRule="auto" w:line="276" w:before="0" w:after="0"/>
+      </w:pPr>
+      <w:r>
+        <w:rPr>
+          <w:rFonts w:ascii="Arial" w:hAnsi="Arial" w:cs="Arial" w:eastAsia="Arial"/>
+          <w:b w:val="0"/>
+          <w:color w:val="000000"/>
+          <w:sz w:val="36"/>
+        </w:rPr>
+      </w:r>
+    </w:p>
+    <w:p>
+      <w:pPr>
+        <w:spacing w:lineRule="auto" w:line="276" w:before="0" w:after="0"/>
+      </w:pPr>
+      <w:r>
+        <w:rPr>
+          <w:rFonts w:ascii="Arial" w:hAnsi="Arial" w:cs="Arial" w:eastAsia="Arial"/>
+          <w:b w:val="0"/>
+          <w:color w:val="000000"/>
+          <w:sz w:val="36"/>
+        </w:rPr>
+        <w:t>-INSTACART SAYS THE CAMERAS ARE THERE ONLY TO RECOGNIZE THE PRODUCTS.</w:t>
+      </w:r>
+    </w:p>
+    <w:p>
+      <w:pPr>
+        <w:spacing w:lineRule="auto" w:line="276" w:before="0" w:after="0"/>
+      </w:pPr>
+      <w:r>
+        <w:rPr>
+          <w:rFonts w:ascii="Arial" w:hAnsi="Arial" w:cs="Arial" w:eastAsia="Arial"/>
+          <w:b w:val="0"/>
+          <w:color w:val="000000"/>
+          <w:sz w:val="36"/>
+        </w:rPr>
+      </w:r>
+    </w:p>
+    <w:p>
+      <w:pPr>
+        <w:spacing w:lineRule="auto" w:line="276" w:before="0" w:after="0"/>
+      </w:pPr>
+      <w:r>
+        <w:rPr>
+          <w:rFonts w:ascii="Arial" w:hAnsi="Arial" w:cs="Arial" w:eastAsia="Arial"/>
+          <w:b w:val="0"/>
+          <w:color w:val="000000"/>
+          <w:sz w:val="36"/>
+        </w:rPr>
+        <w:t>-HAVE A LOOK AT ONE OF THESE CARTS ROLLING DOWN A GROCERY AISLE…</w:t>
+      </w:r>
+    </w:p>
+    <w:p>
+      <w:pPr>
+        <w:spacing w:lineRule="auto" w:line="276" w:before="0" w:after="0"/>
+      </w:pPr>
+      <w:r>
+        <w:rPr>
+          <w:rFonts w:ascii="Arial" w:hAnsi="Arial" w:cs="Arial" w:eastAsia="Arial"/>
+          <w:b w:val="0"/>
+          <w:color w:val="000000"/>
+          <w:sz w:val="36"/>
+        </w:rPr>
+      </w:r>
+    </w:p>
+    <w:p>
+      <w:pPr>
+        <w:spacing w:lineRule="auto" w:line="276" w:before="0" w:after="0"/>
+      </w:pPr>
+      <w:r>
+        <w:rPr>
+          <w:rFonts w:ascii="Arial" w:hAnsi="Arial" w:cs="Arial" w:eastAsia="Arial"/>
+          <w:b/>
+          <w:color w:val="FF0000"/>
+          <w:sz w:val="36"/>
+        </w:rPr>
+        <w:t>(((PLAY CLIP XXX VERTICAL BROLL)))</w:t>
+      </w:r>
+    </w:p>
+    <w:p>
+      <w:pPr>
+        <w:spacing w:lineRule="auto" w:line="276" w:before="0" w:after="0"/>
+      </w:pPr>
+      <w:r>
+        <w:rPr>
+          <w:rFonts w:ascii="Arial" w:hAnsi="Arial" w:cs="Arial" w:eastAsia="Arial"/>
+          <w:b/>
+          <w:color w:val="FF0000"/>
+          <w:sz w:val="36"/>
+        </w:rPr>
+        <w:t>OUT:</w:t>
+      </w:r>
+    </w:p>
+    <w:p>
+      <w:pPr>
+        <w:spacing w:lineRule="auto" w:line="276" w:before="0" w:after="0"/>
+      </w:pPr>
+      <w:r>
+        <w:rPr>
+          <w:rFonts w:ascii="Arial" w:hAnsi="Arial" w:cs="Arial" w:eastAsia="Arial"/>
+          <w:b/>
+          <w:color w:val="1155CC"/>
+          <w:sz w:val="36"/>
+        </w:rPr>
+        <w:t xml:space="preserve">L07-A3 — explainer_demo/creator_short / vertical</w:t>
+      </w:r>
+    </w:p>
+    <w:p>
+      <w:pPr>
+        <w:spacing w:lineRule="auto" w:line="276" w:before="0" w:after="0"/>
+      </w:pPr>
+      <w:r>
+        <w:rPr>
+          <w:rFonts w:ascii="Arial" w:hAnsi="Arial" w:cs="Arial" w:eastAsia="Arial"/>
+          <w:b w:val="0"/>
+          <w:color w:val="1155CC"/>
+          <w:sz w:val="36"/>
+        </w:rPr>
+        <w:t xml:space="preserve">Meet Caper Cart. The new smart cart from Instacart. (Instacart)  —  </w:t>
       </w:r>
       <w:hyperlink r:id="rIdClip3">
         <w:r>
@@ -1557,7 +1947,7 @@
             <w:u w:val="single"/>
             <w:sz w:val="36"/>
           </w:rPr>
-          <w:t xml:space="preserve">https://www.foxnews.com/tech/license-plate-cameras-home-depot-lowes-spark-privacy-fears.amp</w:t>
+          <w:t xml:space="preserve">https://www.youtube.com/watch?v=IO1wx3zBR6s</w:t>
         </w:r>
       </w:hyperlink>
     </w:p>
@@ -1568,11 +1958,71 @@
       <w:r>
         <w:rPr>
           <w:rFonts w:ascii="Arial" w:hAnsi="Arial" w:cs="Arial" w:eastAsia="Arial"/>
+          <w:b/>
+          <w:color w:val="1155CC"/>
+          <w:sz w:val="36"/>
+        </w:rPr>
+        <w:t xml:space="preserve">IN 0:00 – OUT 0:43</w:t>
+      </w:r>
+      <w:r>
+        <w:rPr>
+          <w:rFonts w:ascii="Arial" w:hAnsi="Arial" w:cs="Arial" w:eastAsia="Arial"/>
+          <w:b w:val="0"/>
+          <w:color w:val="1155CC"/>
+          <w:sz w:val="36"/>
+        </w:rPr>
+        <w:t xml:space="preserve">   OUTCUE: “them and even add them back”</w:t>
+      </w:r>
+    </w:p>
+    <w:p>
+      <w:pPr>
+        <w:spacing w:lineRule="auto" w:line="276" w:before="0" w:after="0"/>
+      </w:pPr>
+      <w:r>
+        <w:rPr>
+          <w:rFonts w:ascii="Arial" w:hAnsi="Arial" w:cs="Arial" w:eastAsia="Arial"/>
+          <w:b/>
+          <w:color w:val="1155CC"/>
+          <w:sz w:val="36"/>
+        </w:rPr>
+        <w:t xml:space="preserve">IN 0:48 – OUT 1:08</w:t>
+      </w:r>
+      <w:r>
+        <w:rPr>
+          <w:rFonts w:ascii="Arial" w:hAnsi="Arial" w:cs="Arial" w:eastAsia="Arial"/>
+          <w:b w:val="0"/>
+          <w:color w:val="1155CC"/>
+          <w:sz w:val="36"/>
+        </w:rPr>
+        <w:t xml:space="preserve">   OUTCUE: “your customer's”</w:t>
+      </w:r>
+    </w:p>
+    <w:p>
+      <w:pPr>
+        <w:spacing w:lineRule="auto" w:line="276" w:before="0" w:after="0"/>
+      </w:pPr>
+      <w:r>
+        <w:rPr>
+          <w:rFonts w:ascii="Arial" w:hAnsi="Arial" w:cs="Arial" w:eastAsia="Arial"/>
           <w:b w:val="0"/>
           <w:color w:val="B7791F"/>
           <w:sz w:val="36"/>
         </w:rPr>
-        <w:t xml:space="preserve">Not flagged: no transcript means no verifiable outcue. Re-run captions to get IN/OUT. No timecode invented.</w:t>
+        <w:t xml:space="preserve">NOTE: ORIENTATION CROSSED: horizontal source on a VERTICAL BROLL marker. No captioned vertical cart footage exists — the only vertical candidate (Omni Talk Short) is a podcast talking head with no cart on screen. Needs a crop or a producer ruling.</w:t>
+      </w:r>
+    </w:p>
+    <w:p>
+      <w:pPr>
+        <w:spacing w:lineRule="auto" w:line="276" w:before="0" w:after="0"/>
+      </w:pPr>
+      <w:r>
+        <w:rPr>
+          <w:rFonts w:ascii="Arial" w:hAnsi="Arial" w:cs="Arial" w:eastAsia="Arial"/>
+          <w:b w:val="0"/>
+          <w:color w:val="B7791F"/>
+          <w:sz w:val="36"/>
+        </w:rPr>
+        <w:t xml:space="preserve">NOTE: Instacart marketing footage — used here to show the product and quote Instacart's own claim</w:t>
       </w:r>
     </w:p>
     <w:p>
@@ -1599,34 +2049,34 @@
           <w:color w:val="000000"/>
           <w:sz w:val="46"/>
         </w:rPr>
-        <w:t>NOW THE SHOPPING CART ITSELF HAS CAMERAS!!</w:t>
-      </w:r>
-    </w:p>
-    <w:p>
-      <w:pPr>
-        <w:spacing w:lineRule="auto" w:line="276" w:before="0" w:after="0"/>
-      </w:pPr>
-      <w:r>
-        <w:rPr>
-          <w:rFonts w:ascii="Arial" w:hAnsi="Arial" w:cs="Arial" w:eastAsia="Arial"/>
-          <w:b w:val="0"/>
-          <w:color w:val="000000"/>
-          <w:sz w:val="36"/>
-        </w:rPr>
-      </w:r>
-    </w:p>
-    <w:p>
-      <w:pPr>
-        <w:spacing w:lineRule="auto" w:line="276" w:before="0" w:after="0"/>
-      </w:pPr>
-      <w:r>
-        <w:rPr>
-          <w:rFonts w:ascii="Arial" w:hAnsi="Arial" w:cs="Arial" w:eastAsia="Arial"/>
-          <w:b w:val="0"/>
-          <w:color w:val="000000"/>
-          <w:sz w:val="36"/>
-        </w:rPr>
-        <w:t xml:space="preserve">-INSTACART MAKES A SMART SHOPPING CART CALLED THE </w:t>
+        <w:t>AND AT SELF-CHECKOUT… AI IS WATCHING YOUR HANDS!</w:t>
+      </w:r>
+    </w:p>
+    <w:p>
+      <w:pPr>
+        <w:spacing w:lineRule="auto" w:line="276" w:before="0" w:after="0"/>
+      </w:pPr>
+      <w:r>
+        <w:rPr>
+          <w:rFonts w:ascii="Arial" w:hAnsi="Arial" w:cs="Arial" w:eastAsia="Arial"/>
+          <w:b w:val="0"/>
+          <w:color w:val="000000"/>
+          <w:sz w:val="36"/>
+        </w:rPr>
+      </w:r>
+    </w:p>
+    <w:p>
+      <w:pPr>
+        <w:spacing w:lineRule="auto" w:line="276" w:before="0" w:after="0"/>
+      </w:pPr>
+      <w:r>
+        <w:rPr>
+          <w:rFonts w:ascii="Arial" w:hAnsi="Arial" w:cs="Arial" w:eastAsia="Arial"/>
+          <w:b w:val="0"/>
+          <w:color w:val="000000"/>
+          <w:sz w:val="36"/>
+        </w:rPr>
+        <w:t xml:space="preserve">-WALMART USES AI CAMERAS AT SELF-CHECKOUT THAT FLAG WHAT THEY THINK IS A </w:t>
       </w:r>
       <w:r>
         <w:rPr>
@@ -1635,7 +2085,7 @@
           <w:color w:val="000000"/>
           <w:sz w:val="36"/>
         </w:rPr>
-        <w:t>CAPER CART</w:t>
+        <w:t>MISSED SCAN</w:t>
       </w:r>
       <w:r>
         <w:rPr>
@@ -1671,169 +2121,196 @@
           <w:color w:val="000000"/>
           <w:sz w:val="36"/>
         </w:rPr>
-        <w:t>-IT HAS CAMERAS POINTED INTO YOUR BASKET… CAMERAS POINTED OUT… AND A LOCATION-TRACKING SYSTEM.</w:t>
-      </w:r>
-    </w:p>
-    <w:p>
-      <w:pPr>
-        <w:spacing w:lineRule="auto" w:line="276" w:before="0" w:after="0"/>
-      </w:pPr>
-      <w:r>
-        <w:rPr>
-          <w:rFonts w:ascii="Arial" w:hAnsi="Arial" w:cs="Arial" w:eastAsia="Arial"/>
-          <w:b w:val="0"/>
-          <w:color w:val="000000"/>
-          <w:sz w:val="36"/>
-        </w:rPr>
-      </w:r>
-    </w:p>
-    <w:p>
-      <w:pPr>
-        <w:spacing w:lineRule="auto" w:line="276" w:before="0" w:after="0"/>
-      </w:pPr>
-      <w:r>
-        <w:rPr>
-          <w:rFonts w:ascii="Arial" w:hAnsi="Arial" w:cs="Arial" w:eastAsia="Arial"/>
-          <w:b w:val="0"/>
-          <w:color w:val="000000"/>
-          <w:sz w:val="36"/>
-        </w:rPr>
-        <w:t>-IT'S ALREADY ROLLING THROUGH STORES IN MORE THAN 100 CITIES IN 15 STATES.</w:t>
-      </w:r>
-    </w:p>
-    <w:p>
-      <w:pPr>
-        <w:spacing w:lineRule="auto" w:line="276" w:before="0" w:after="0"/>
-      </w:pPr>
-      <w:r>
-        <w:rPr>
-          <w:rFonts w:ascii="Arial" w:hAnsi="Arial" w:cs="Arial" w:eastAsia="Arial"/>
-          <w:b w:val="0"/>
-          <w:color w:val="000000"/>
-          <w:sz w:val="36"/>
-        </w:rPr>
-      </w:r>
-    </w:p>
-    <w:p>
-      <w:pPr>
-        <w:spacing w:lineRule="auto" w:line="276" w:before="0" w:after="0"/>
-      </w:pPr>
-      <w:r>
-        <w:rPr>
-          <w:rFonts w:ascii="Arial" w:hAnsi="Arial" w:cs="Arial" w:eastAsia="Arial"/>
-          <w:b w:val="0"/>
-          <w:color w:val="000000"/>
-          <w:sz w:val="36"/>
-        </w:rPr>
-        <w:t>-SHOPRITE, WEGMANS AND WEIS MARKETS ARE ALL USING THEM RIGHT NOW!</w:t>
-      </w:r>
-    </w:p>
-    <w:p>
-      <w:pPr>
-        <w:spacing w:lineRule="auto" w:line="276" w:before="0" w:after="0"/>
-      </w:pPr>
-      <w:r>
-        <w:rPr>
-          <w:rFonts w:ascii="Arial" w:hAnsi="Arial" w:cs="Arial" w:eastAsia="Arial"/>
-          <w:b w:val="0"/>
-          <w:color w:val="000000"/>
-          <w:sz w:val="36"/>
-        </w:rPr>
-      </w:r>
-    </w:p>
-    <w:p>
-      <w:pPr>
-        <w:spacing w:lineRule="auto" w:line="276" w:before="0" w:after="0"/>
-      </w:pPr>
-      <w:r>
-        <w:rPr>
-          <w:rFonts w:ascii="Arial" w:hAnsi="Arial" w:cs="Arial" w:eastAsia="Arial"/>
-          <w:b w:val="0"/>
-          <w:color w:val="000000"/>
-          <w:sz w:val="36"/>
-        </w:rPr>
-        <w:t>-THE CART KNOWS WHAT YOU PUT IN IT…</w:t>
-      </w:r>
-    </w:p>
-    <w:p>
-      <w:pPr>
-        <w:spacing w:lineRule="auto" w:line="276" w:before="0" w:after="0"/>
-      </w:pPr>
-      <w:r>
-        <w:rPr>
-          <w:rFonts w:ascii="Arial" w:hAnsi="Arial" w:cs="Arial" w:eastAsia="Arial"/>
-          <w:b w:val="0"/>
-          <w:color w:val="000000"/>
-          <w:sz w:val="36"/>
-        </w:rPr>
-      </w:r>
-    </w:p>
-    <w:p>
-      <w:pPr>
-        <w:spacing w:lineRule="auto" w:line="276" w:before="0" w:after="0"/>
-      </w:pPr>
-      <w:r>
-        <w:rPr>
-          <w:rFonts w:ascii="Arial" w:hAnsi="Arial" w:cs="Arial" w:eastAsia="Arial"/>
-          <w:b w:val="0"/>
-          <w:color w:val="000000"/>
-          <w:sz w:val="36"/>
-        </w:rPr>
-        <w:t>-AND IT PUTS ADS AND COUPONS ON THE SCREEN RIGHT IN FRONT OF YOU.</w:t>
-      </w:r>
-    </w:p>
-    <w:p>
-      <w:pPr>
-        <w:spacing w:lineRule="auto" w:line="276" w:before="0" w:after="0"/>
-      </w:pPr>
-      <w:r>
-        <w:rPr>
-          <w:rFonts w:ascii="Arial" w:hAnsi="Arial" w:cs="Arial" w:eastAsia="Arial"/>
-          <w:b w:val="0"/>
-          <w:color w:val="000000"/>
-          <w:sz w:val="36"/>
-        </w:rPr>
-      </w:r>
-    </w:p>
-    <w:p>
-      <w:pPr>
-        <w:spacing w:lineRule="auto" w:line="276" w:before="0" w:after="0"/>
-      </w:pPr>
-      <w:r>
-        <w:rPr>
-          <w:rFonts w:ascii="Arial" w:hAnsi="Arial" w:cs="Arial" w:eastAsia="Arial"/>
-          <w:b w:val="0"/>
-          <w:color w:val="000000"/>
-          <w:sz w:val="36"/>
-        </w:rPr>
-        <w:t>-INSTACART SAYS THE CAMERAS ARE THERE ONLY TO RECOGNIZE THE PRODUCTS.</w:t>
-      </w:r>
-    </w:p>
-    <w:p>
-      <w:pPr>
-        <w:spacing w:lineRule="auto" w:line="276" w:before="0" w:after="0"/>
-      </w:pPr>
-      <w:r>
-        <w:rPr>
-          <w:rFonts w:ascii="Arial" w:hAnsi="Arial" w:cs="Arial" w:eastAsia="Arial"/>
-          <w:b w:val="0"/>
-          <w:color w:val="000000"/>
-          <w:sz w:val="36"/>
-        </w:rPr>
-      </w:r>
-    </w:p>
-    <w:p>
-      <w:pPr>
-        <w:spacing w:lineRule="auto" w:line="276" w:before="0" w:after="0"/>
-      </w:pPr>
-      <w:r>
-        <w:rPr>
-          <w:rFonts w:ascii="Arial" w:hAnsi="Arial" w:cs="Arial" w:eastAsia="Arial"/>
-          <w:b w:val="0"/>
-          <w:color w:val="000000"/>
-          <w:sz w:val="36"/>
-        </w:rPr>
-        <w:t>-HAVE A LOOK AT ONE OF THESE CARTS ROLLING DOWN A GROCERY AISLE…</w:t>
+        <w:t>-THE CAMERA SEES AN ITEM… THE SCALE DOESN'T MATCH…</w:t>
+      </w:r>
+    </w:p>
+    <w:p>
+      <w:pPr>
+        <w:spacing w:lineRule="auto" w:line="276" w:before="0" w:after="0"/>
+      </w:pPr>
+      <w:r>
+        <w:rPr>
+          <w:rFonts w:ascii="Arial" w:hAnsi="Arial" w:cs="Arial" w:eastAsia="Arial"/>
+          <w:b w:val="0"/>
+          <w:color w:val="000000"/>
+          <w:sz w:val="36"/>
+        </w:rPr>
+      </w:r>
+    </w:p>
+    <w:p>
+      <w:pPr>
+        <w:spacing w:lineRule="auto" w:line="276" w:before="0" w:after="0"/>
+      </w:pPr>
+      <w:r>
+        <w:rPr>
+          <w:rFonts w:ascii="Arial" w:hAnsi="Arial" w:cs="Arial" w:eastAsia="Arial"/>
+          <w:b w:val="0"/>
+          <w:color w:val="000000"/>
+          <w:sz w:val="36"/>
+        </w:rPr>
+        <w:t>-AND AN ALERT GOES STRAIGHT TO AN EMPLOYEE'S HANDHELD.</w:t>
+      </w:r>
+    </w:p>
+    <w:p>
+      <w:pPr>
+        <w:spacing w:lineRule="auto" w:line="276" w:before="0" w:after="0"/>
+      </w:pPr>
+      <w:r>
+        <w:rPr>
+          <w:rFonts w:ascii="Arial" w:hAnsi="Arial" w:cs="Arial" w:eastAsia="Arial"/>
+          <w:b w:val="0"/>
+          <w:color w:val="000000"/>
+          <w:sz w:val="36"/>
+        </w:rPr>
+      </w:r>
+    </w:p>
+    <w:p>
+      <w:pPr>
+        <w:spacing w:lineRule="auto" w:line="276" w:before="0" w:after="0"/>
+      </w:pPr>
+      <w:r>
+        <w:rPr>
+          <w:rFonts w:ascii="Arial" w:hAnsi="Arial" w:cs="Arial" w:eastAsia="Arial"/>
+          <w:b w:val="0"/>
+          <w:color w:val="000000"/>
+          <w:sz w:val="36"/>
+        </w:rPr>
+        <w:t xml:space="preserve">-BUT THESE MACHINES DON'T ALWAYS WORK… AND WHEN THEY DON'T, IT CAN BE YOU WHO GETS BLAMED.</w:t>
+      </w:r>
+    </w:p>
+    <w:p>
+      <w:pPr>
+        <w:spacing w:lineRule="auto" w:line="276" w:before="0" w:after="0"/>
+      </w:pPr>
+      <w:r>
+        <w:rPr>
+          <w:rFonts w:ascii="Arial" w:hAnsi="Arial" w:cs="Arial" w:eastAsia="Arial"/>
+          <w:b w:val="0"/>
+          <w:color w:val="000000"/>
+          <w:sz w:val="36"/>
+        </w:rPr>
+      </w:r>
+    </w:p>
+    <w:p>
+      <w:pPr>
+        <w:spacing w:lineRule="auto" w:line="276" w:before="0" w:after="0"/>
+      </w:pPr>
+      <w:r>
+        <w:rPr>
+          <w:rFonts w:ascii="Arial" w:hAnsi="Arial" w:cs="Arial" w:eastAsia="Arial"/>
+          <w:b w:val="0"/>
+          <w:color w:val="000000"/>
+          <w:sz w:val="36"/>
+        </w:rPr>
+        <w:t xml:space="preserve">-LESLEIGH NURSE WAS AT SELF-CHECKOUT AT THE WALMART IN SEMMES, ALABAMA… WITH HER HUSBAND AND THREE KIDS.</w:t>
+      </w:r>
+    </w:p>
+    <w:p>
+      <w:pPr>
+        <w:spacing w:lineRule="auto" w:line="276" w:before="0" w:after="0"/>
+      </w:pPr>
+      <w:r>
+        <w:rPr>
+          <w:rFonts w:ascii="Arial" w:hAnsi="Arial" w:cs="Arial" w:eastAsia="Arial"/>
+          <w:b w:val="0"/>
+          <w:color w:val="000000"/>
+          <w:sz w:val="36"/>
+        </w:rPr>
+      </w:r>
+    </w:p>
+    <w:p>
+      <w:pPr>
+        <w:spacing w:lineRule="auto" w:line="276" w:before="0" w:after="0"/>
+      </w:pPr>
+      <w:r>
+        <w:rPr>
+          <w:rFonts w:ascii="Arial" w:hAnsi="Arial" w:cs="Arial" w:eastAsia="Arial"/>
+          <w:b w:val="0"/>
+          <w:color w:val="000000"/>
+          <w:sz w:val="36"/>
+        </w:rPr>
+        <w:t xml:space="preserve">-HER SCANNER KEPT MALFUNCTIONING… SHE EVEN GOT A WALMART WORKER TO HELP HER.</w:t>
+      </w:r>
+    </w:p>
+    <w:p>
+      <w:pPr>
+        <w:spacing w:lineRule="auto" w:line="276" w:before="0" w:after="0"/>
+      </w:pPr>
+      <w:r>
+        <w:rPr>
+          <w:rFonts w:ascii="Arial" w:hAnsi="Arial" w:cs="Arial" w:eastAsia="Arial"/>
+          <w:b w:val="0"/>
+          <w:color w:val="000000"/>
+          <w:sz w:val="36"/>
+        </w:rPr>
+      </w:r>
+    </w:p>
+    <w:p>
+      <w:pPr>
+        <w:spacing w:lineRule="auto" w:line="276" w:before="0" w:after="0"/>
+      </w:pPr>
+      <w:r>
+        <w:rPr>
+          <w:rFonts w:ascii="Arial" w:hAnsi="Arial" w:cs="Arial" w:eastAsia="Arial"/>
+          <w:b w:val="0"/>
+          <w:color w:val="000000"/>
+          <w:sz w:val="36"/>
+        </w:rPr>
+        <w:t xml:space="preserve">-SHE THOUGHT SHE HAD PAID FOR EVERYTHING… THEN AN ASSET PROTECTION MANAGER STOPPED HER AT THE DOOR.</w:t>
+      </w:r>
+    </w:p>
+    <w:p>
+      <w:pPr>
+        <w:spacing w:lineRule="auto" w:line="276" w:before="0" w:after="0"/>
+      </w:pPr>
+      <w:r>
+        <w:rPr>
+          <w:rFonts w:ascii="Arial" w:hAnsi="Arial" w:cs="Arial" w:eastAsia="Arial"/>
+          <w:b w:val="0"/>
+          <w:color w:val="000000"/>
+          <w:sz w:val="36"/>
+        </w:rPr>
+      </w:r>
+    </w:p>
+    <w:p>
+      <w:pPr>
+        <w:spacing w:lineRule="auto" w:line="276" w:before="0" w:after="0"/>
+      </w:pPr>
+      <w:r>
+        <w:rPr>
+          <w:rFonts w:ascii="Arial" w:hAnsi="Arial" w:cs="Arial" w:eastAsia="Arial"/>
+          <w:b w:val="0"/>
+          <w:color w:val="000000"/>
+          <w:sz w:val="36"/>
+        </w:rPr>
+        <w:t xml:space="preserve">-SHE WAS CHARGED WITH STEALING 48 DOLLARS OF GROCERIES… ARRESTED… AND HER MUG SHOT WAS TAKEN.</w:t>
+      </w:r>
+    </w:p>
+    <w:p>
+      <w:pPr>
+        <w:spacing w:lineRule="auto" w:line="276" w:before="0" w:after="0"/>
+      </w:pPr>
+      <w:r>
+        <w:rPr>
+          <w:rFonts w:ascii="Arial" w:hAnsi="Arial" w:cs="Arial" w:eastAsia="Arial"/>
+          <w:b w:val="0"/>
+          <w:color w:val="000000"/>
+          <w:sz w:val="36"/>
+        </w:rPr>
+      </w:r>
+    </w:p>
+    <w:p>
+      <w:pPr>
+        <w:spacing w:lineRule="auto" w:line="276" w:before="0" w:after="0"/>
+      </w:pPr>
+      <w:r>
+        <w:rPr>
+          <w:rFonts w:ascii="Arial" w:hAnsi="Arial" w:cs="Arial" w:eastAsia="Arial"/>
+          <w:b w:val="0"/>
+          <w:color w:val="000000"/>
+          <w:sz w:val="36"/>
+        </w:rPr>
+        <w:t>-THINK WHAT YOU WOULD DO IF THIS HAPPENED TO YOU…</w:t>
       </w:r>
     </w:p>
     <w:p>
@@ -1860,7 +2337,7 @@
           <w:color w:val="FF0000"/>
           <w:sz w:val="36"/>
         </w:rPr>
-        <w:t>(((PLAY CLIP XXX VERTICAL BROLL)))</w:t>
+        <w:t>(((PLAY CLIP XXX HORIZONTAL)))</w:t>
       </w:r>
     </w:p>
     <w:p>
@@ -1885,409 +2362,26 @@
         <w:rPr>
           <w:rFonts w:ascii="Arial" w:hAnsi="Arial" w:cs="Arial" w:eastAsia="Arial"/>
           <w:b/>
-          <w:color w:val="B7791F"/>
-          <w:sz w:val="36"/>
-        </w:rPr>
-        <w:t xml:space="preserve">L07-A3 — explainer_demo/creator_short / vertical  ·  PENDING CAPTIONS — YOUTUBE BLOCKED THIS RUN</w:t>
-      </w:r>
-    </w:p>
-    <w:p>
-      <w:pPr>
-        <w:spacing w:lineRule="auto" w:line="276" w:before="0" w:after="0"/>
-      </w:pPr>
-      <w:r>
-        <w:rPr>
-          <w:rFonts w:ascii="Arial" w:hAnsi="Arial" w:cs="Arial" w:eastAsia="Arial"/>
-          <w:b w:val="0"/>
-          <w:color w:val="B7791F"/>
-          <w:sz w:val="36"/>
-        </w:rPr>
-        <w:t xml:space="preserve">Top candidate:  </w:t>
+          <w:color w:val="1155CC"/>
+          <w:sz w:val="36"/>
+        </w:rPr>
+        <w:t xml:space="preserve">L07-A4 — victim_interview / horizontal  ·  APPROVED SWAP</w:t>
+      </w:r>
+    </w:p>
+    <w:p>
+      <w:pPr>
+        <w:spacing w:lineRule="auto" w:line="276" w:before="0" w:after="0"/>
+      </w:pPr>
+      <w:r>
+        <w:rPr>
+          <w:rFonts w:ascii="Arial" w:hAnsi="Arial" w:cs="Arial" w:eastAsia="Arial"/>
+          <w:b w:val="0"/>
+          <w:color w:val="1155CC"/>
+          <w:sz w:val="36"/>
+        </w:rPr>
+        <w:t xml:space="preserve">Alabama woman falsely accused of shoplifting awarded $2.1 million in Walmart suit (CBS News / WKRG)  —  </w:t>
       </w:r>
       <w:hyperlink r:id="rIdClip4">
-        <w:r>
-          <w:rPr>
-            <w:rFonts w:ascii="Arial" w:hAnsi="Arial" w:cs="Arial" w:eastAsia="Arial"/>
-            <w:b w:val="0"/>
-            <w:color w:val="1155CC"/>
-            <w:u w:val="single"/>
-            <w:sz w:val="36"/>
-          </w:rPr>
-          <w:t xml:space="preserve">https://www.youtube.com/shorts/jqTpde_UWs4</w:t>
-        </w:r>
-      </w:hyperlink>
-    </w:p>
-    <w:p>
-      <w:pPr>
-        <w:spacing w:lineRule="auto" w:line="276" w:before="0" w:after="0"/>
-      </w:pPr>
-      <w:r>
-        <w:rPr>
-          <w:rFonts w:ascii="Arial" w:hAnsi="Arial" w:cs="Arial" w:eastAsia="Arial"/>
-          <w:b w:val="0"/>
-          <w:color w:val="B7791F"/>
-          <w:sz w:val="36"/>
-        </w:rPr>
-        <w:t xml:space="preserve">Not flagged: no transcript means no verifiable outcue. Re-run captions to get IN/OUT. No timecode invented.</w:t>
-      </w:r>
-    </w:p>
-    <w:p>
-      <w:pPr>
-        <w:spacing w:lineRule="auto" w:line="276" w:before="0" w:after="0"/>
-      </w:pPr>
-      <w:r>
-        <w:rPr>
-          <w:rFonts w:ascii="Arial" w:hAnsi="Arial" w:cs="Arial" w:eastAsia="Arial"/>
-          <w:b w:val="0"/>
-          <w:color w:val="000000"/>
-          <w:sz w:val="36"/>
-        </w:rPr>
-      </w:r>
-    </w:p>
-    <w:p>
-      <w:pPr>
-        <w:spacing w:lineRule="auto" w:line="276" w:before="0" w:after="0"/>
-      </w:pPr>
-      <w:r>
-        <w:rPr>
-          <w:rFonts w:ascii="Arial" w:hAnsi="Arial" w:cs="Arial" w:eastAsia="Arial"/>
-          <w:b/>
-          <w:color w:val="000000"/>
-          <w:sz w:val="46"/>
-        </w:rPr>
-        <w:t>AND AT SELF-CHECKOUT… AI IS WATCHING YOUR HANDS!</w:t>
-      </w:r>
-    </w:p>
-    <w:p>
-      <w:pPr>
-        <w:spacing w:lineRule="auto" w:line="276" w:before="0" w:after="0"/>
-      </w:pPr>
-      <w:r>
-        <w:rPr>
-          <w:rFonts w:ascii="Arial" w:hAnsi="Arial" w:cs="Arial" w:eastAsia="Arial"/>
-          <w:b w:val="0"/>
-          <w:color w:val="000000"/>
-          <w:sz w:val="36"/>
-        </w:rPr>
-      </w:r>
-    </w:p>
-    <w:p>
-      <w:pPr>
-        <w:spacing w:lineRule="auto" w:line="276" w:before="0" w:after="0"/>
-      </w:pPr>
-      <w:r>
-        <w:rPr>
-          <w:rFonts w:ascii="Arial" w:hAnsi="Arial" w:cs="Arial" w:eastAsia="Arial"/>
-          <w:b w:val="0"/>
-          <w:color w:val="000000"/>
-          <w:sz w:val="36"/>
-        </w:rPr>
-        <w:t xml:space="preserve">-WALMART USES AI CAMERAS AT SELF-CHECKOUT THAT FLAG WHAT THEY THINK IS A </w:t>
-      </w:r>
-      <w:r>
-        <w:rPr>
-          <w:rFonts w:ascii="Arial" w:hAnsi="Arial" w:cs="Arial" w:eastAsia="Arial"/>
-          <w:b/>
-          <w:color w:val="000000"/>
-          <w:sz w:val="36"/>
-        </w:rPr>
-        <w:t>MISSED SCAN</w:t>
-      </w:r>
-      <w:r>
-        <w:rPr>
-          <w:rFonts w:ascii="Arial" w:hAnsi="Arial" w:cs="Arial" w:eastAsia="Arial"/>
-          <w:b w:val="0"/>
-          <w:color w:val="000000"/>
-          <w:sz w:val="36"/>
-        </w:rPr>
-        <w:t>.</w:t>
-      </w:r>
-    </w:p>
-    <w:p>
-      <w:pPr>
-        <w:spacing w:lineRule="auto" w:line="276" w:before="0" w:after="0"/>
-      </w:pPr>
-      <w:r>
-        <w:rPr>
-          <w:rFonts w:ascii="Arial" w:hAnsi="Arial" w:cs="Arial" w:eastAsia="Arial"/>
-          <w:b w:val="0"/>
-          <w:color w:val="000000"/>
-          <w:sz w:val="36"/>
-        </w:rPr>
-      </w:r>
-    </w:p>
-    <w:p>
-      <w:pPr>
-        <w:spacing w:lineRule="auto" w:line="276" w:before="0" w:after="0"/>
-      </w:pPr>
-      <w:r>
-        <w:rPr>
-          <w:rFonts w:ascii="Arial" w:hAnsi="Arial" w:cs="Arial" w:eastAsia="Arial"/>
-          <w:b w:val="0"/>
-          <w:color w:val="000000"/>
-          <w:sz w:val="36"/>
-        </w:rPr>
-        <w:t>-THE CAMERA SEES AN ITEM… THE SCALE DOESN'T MATCH…</w:t>
-      </w:r>
-    </w:p>
-    <w:p>
-      <w:pPr>
-        <w:spacing w:lineRule="auto" w:line="276" w:before="0" w:after="0"/>
-      </w:pPr>
-      <w:r>
-        <w:rPr>
-          <w:rFonts w:ascii="Arial" w:hAnsi="Arial" w:cs="Arial" w:eastAsia="Arial"/>
-          <w:b w:val="0"/>
-          <w:color w:val="000000"/>
-          <w:sz w:val="36"/>
-        </w:rPr>
-      </w:r>
-    </w:p>
-    <w:p>
-      <w:pPr>
-        <w:spacing w:lineRule="auto" w:line="276" w:before="0" w:after="0"/>
-      </w:pPr>
-      <w:r>
-        <w:rPr>
-          <w:rFonts w:ascii="Arial" w:hAnsi="Arial" w:cs="Arial" w:eastAsia="Arial"/>
-          <w:b w:val="0"/>
-          <w:color w:val="000000"/>
-          <w:sz w:val="36"/>
-        </w:rPr>
-        <w:t>-AND AN ALERT GOES STRAIGHT TO AN EMPLOYEE'S HANDHELD.</w:t>
-      </w:r>
-    </w:p>
-    <w:p>
-      <w:pPr>
-        <w:spacing w:lineRule="auto" w:line="276" w:before="0" w:after="0"/>
-      </w:pPr>
-      <w:r>
-        <w:rPr>
-          <w:rFonts w:ascii="Arial" w:hAnsi="Arial" w:cs="Arial" w:eastAsia="Arial"/>
-          <w:b w:val="0"/>
-          <w:color w:val="000000"/>
-          <w:sz w:val="36"/>
-        </w:rPr>
-      </w:r>
-    </w:p>
-    <w:p>
-      <w:pPr>
-        <w:spacing w:lineRule="auto" w:line="276" w:before="0" w:after="0"/>
-      </w:pPr>
-      <w:r>
-        <w:rPr>
-          <w:rFonts w:ascii="Arial" w:hAnsi="Arial" w:cs="Arial" w:eastAsia="Arial"/>
-          <w:b w:val="0"/>
-          <w:color w:val="000000"/>
-          <w:sz w:val="36"/>
-        </w:rPr>
-        <w:t xml:space="preserve">-BUT THESE MACHINES DON'T ALWAYS WORK… AND WHEN THEY DON'T, IT CAN BE YOU WHO GETS BLAMED.</w:t>
-      </w:r>
-    </w:p>
-    <w:p>
-      <w:pPr>
-        <w:spacing w:lineRule="auto" w:line="276" w:before="0" w:after="0"/>
-      </w:pPr>
-      <w:r>
-        <w:rPr>
-          <w:rFonts w:ascii="Arial" w:hAnsi="Arial" w:cs="Arial" w:eastAsia="Arial"/>
-          <w:b w:val="0"/>
-          <w:color w:val="000000"/>
-          <w:sz w:val="36"/>
-        </w:rPr>
-      </w:r>
-    </w:p>
-    <w:p>
-      <w:pPr>
-        <w:spacing w:lineRule="auto" w:line="276" w:before="0" w:after="0"/>
-      </w:pPr>
-      <w:r>
-        <w:rPr>
-          <w:rFonts w:ascii="Arial" w:hAnsi="Arial" w:cs="Arial" w:eastAsia="Arial"/>
-          <w:b w:val="0"/>
-          <w:color w:val="000000"/>
-          <w:sz w:val="36"/>
-        </w:rPr>
-        <w:t xml:space="preserve">-LESLEIGH NURSE WAS AT SELF-CHECKOUT AT THE WALMART IN SEMMES, ALABAMA… WITH HER HUSBAND AND THREE KIDS.</w:t>
-      </w:r>
-    </w:p>
-    <w:p>
-      <w:pPr>
-        <w:spacing w:lineRule="auto" w:line="276" w:before="0" w:after="0"/>
-      </w:pPr>
-      <w:r>
-        <w:rPr>
-          <w:rFonts w:ascii="Arial" w:hAnsi="Arial" w:cs="Arial" w:eastAsia="Arial"/>
-          <w:b w:val="0"/>
-          <w:color w:val="000000"/>
-          <w:sz w:val="36"/>
-        </w:rPr>
-      </w:r>
-    </w:p>
-    <w:p>
-      <w:pPr>
-        <w:spacing w:lineRule="auto" w:line="276" w:before="0" w:after="0"/>
-      </w:pPr>
-      <w:r>
-        <w:rPr>
-          <w:rFonts w:ascii="Arial" w:hAnsi="Arial" w:cs="Arial" w:eastAsia="Arial"/>
-          <w:b w:val="0"/>
-          <w:color w:val="000000"/>
-          <w:sz w:val="36"/>
-        </w:rPr>
-        <w:t xml:space="preserve">-HER SCANNER KEPT MALFUNCTIONING… SHE EVEN GOT A WALMART WORKER TO HELP HER.</w:t>
-      </w:r>
-    </w:p>
-    <w:p>
-      <w:pPr>
-        <w:spacing w:lineRule="auto" w:line="276" w:before="0" w:after="0"/>
-      </w:pPr>
-      <w:r>
-        <w:rPr>
-          <w:rFonts w:ascii="Arial" w:hAnsi="Arial" w:cs="Arial" w:eastAsia="Arial"/>
-          <w:b w:val="0"/>
-          <w:color w:val="000000"/>
-          <w:sz w:val="36"/>
-        </w:rPr>
-      </w:r>
-    </w:p>
-    <w:p>
-      <w:pPr>
-        <w:spacing w:lineRule="auto" w:line="276" w:before="0" w:after="0"/>
-      </w:pPr>
-      <w:r>
-        <w:rPr>
-          <w:rFonts w:ascii="Arial" w:hAnsi="Arial" w:cs="Arial" w:eastAsia="Arial"/>
-          <w:b w:val="0"/>
-          <w:color w:val="000000"/>
-          <w:sz w:val="36"/>
-        </w:rPr>
-        <w:t xml:space="preserve">-SHE THOUGHT SHE HAD PAID FOR EVERYTHING… THEN AN ASSET PROTECTION MANAGER STOPPED HER AT THE DOOR.</w:t>
-      </w:r>
-    </w:p>
-    <w:p>
-      <w:pPr>
-        <w:spacing w:lineRule="auto" w:line="276" w:before="0" w:after="0"/>
-      </w:pPr>
-      <w:r>
-        <w:rPr>
-          <w:rFonts w:ascii="Arial" w:hAnsi="Arial" w:cs="Arial" w:eastAsia="Arial"/>
-          <w:b w:val="0"/>
-          <w:color w:val="000000"/>
-          <w:sz w:val="36"/>
-        </w:rPr>
-      </w:r>
-    </w:p>
-    <w:p>
-      <w:pPr>
-        <w:spacing w:lineRule="auto" w:line="276" w:before="0" w:after="0"/>
-      </w:pPr>
-      <w:r>
-        <w:rPr>
-          <w:rFonts w:ascii="Arial" w:hAnsi="Arial" w:cs="Arial" w:eastAsia="Arial"/>
-          <w:b w:val="0"/>
-          <w:color w:val="000000"/>
-          <w:sz w:val="36"/>
-        </w:rPr>
-        <w:t xml:space="preserve">-SHE WAS CHARGED WITH STEALING 48 DOLLARS OF GROCERIES… ARRESTED… AND HER MUG SHOT WAS TAKEN.</w:t>
-      </w:r>
-    </w:p>
-    <w:p>
-      <w:pPr>
-        <w:spacing w:lineRule="auto" w:line="276" w:before="0" w:after="0"/>
-      </w:pPr>
-      <w:r>
-        <w:rPr>
-          <w:rFonts w:ascii="Arial" w:hAnsi="Arial" w:cs="Arial" w:eastAsia="Arial"/>
-          <w:b w:val="0"/>
-          <w:color w:val="000000"/>
-          <w:sz w:val="36"/>
-        </w:rPr>
-      </w:r>
-    </w:p>
-    <w:p>
-      <w:pPr>
-        <w:spacing w:lineRule="auto" w:line="276" w:before="0" w:after="0"/>
-      </w:pPr>
-      <w:r>
-        <w:rPr>
-          <w:rFonts w:ascii="Arial" w:hAnsi="Arial" w:cs="Arial" w:eastAsia="Arial"/>
-          <w:b w:val="0"/>
-          <w:color w:val="000000"/>
-          <w:sz w:val="36"/>
-        </w:rPr>
-        <w:t>-THINK WHAT YOU WOULD DO IF THIS HAPPENED TO YOU…</w:t>
-      </w:r>
-    </w:p>
-    <w:p>
-      <w:pPr>
-        <w:spacing w:lineRule="auto" w:line="276" w:before="0" w:after="0"/>
-      </w:pPr>
-      <w:r>
-        <w:rPr>
-          <w:rFonts w:ascii="Arial" w:hAnsi="Arial" w:cs="Arial" w:eastAsia="Arial"/>
-          <w:b w:val="0"/>
-          <w:color w:val="000000"/>
-          <w:sz w:val="36"/>
-        </w:rPr>
-      </w:r>
-    </w:p>
-    <w:p>
-      <w:pPr>
-        <w:spacing w:lineRule="auto" w:line="276" w:before="0" w:after="0"/>
-      </w:pPr>
-      <w:r>
-        <w:rPr>
-          <w:rFonts w:ascii="Arial" w:hAnsi="Arial" w:cs="Arial" w:eastAsia="Arial"/>
-          <w:b/>
-          <w:color w:val="FF0000"/>
-          <w:sz w:val="36"/>
-        </w:rPr>
-        <w:t>(((PLAY CLIP XXX HORIZONTAL)))</w:t>
-      </w:r>
-    </w:p>
-    <w:p>
-      <w:pPr>
-        <w:spacing w:lineRule="auto" w:line="276" w:before="0" w:after="0"/>
-      </w:pPr>
-      <w:r>
-        <w:rPr>
-          <w:rFonts w:ascii="Arial" w:hAnsi="Arial" w:cs="Arial" w:eastAsia="Arial"/>
-          <w:b/>
-          <w:color w:val="FF0000"/>
-          <w:sz w:val="36"/>
-        </w:rPr>
-        <w:t>OUT:</w:t>
-      </w:r>
-    </w:p>
-    <w:p>
-      <w:pPr>
-        <w:spacing w:lineRule="auto" w:line="276" w:before="0" w:after="0"/>
-      </w:pPr>
-      <w:r>
-        <w:rPr>
-          <w:rFonts w:ascii="Arial" w:hAnsi="Arial" w:cs="Arial" w:eastAsia="Arial"/>
-          <w:b/>
-          <w:color w:val="1155CC"/>
-          <w:sz w:val="36"/>
-        </w:rPr>
-        <w:t xml:space="preserve">L07-A4 — victim_interview / horizontal  ·  APPROVED SWAP</w:t>
-      </w:r>
-    </w:p>
-    <w:p>
-      <w:pPr>
-        <w:spacing w:lineRule="auto" w:line="276" w:before="0" w:after="0"/>
-      </w:pPr>
-      <w:r>
-        <w:rPr>
-          <w:rFonts w:ascii="Arial" w:hAnsi="Arial" w:cs="Arial" w:eastAsia="Arial"/>
-          <w:b w:val="0"/>
-          <w:color w:val="1155CC"/>
-          <w:sz w:val="36"/>
-        </w:rPr>
-        <w:t xml:space="preserve">Alabama woman falsely accused of shoplifting awarded $2.1 million in Walmart suit (CBS News / WKRG)  —  </w:t>
-      </w:r>
-      <w:hyperlink r:id="rIdClip5">
         <w:r>
           <w:rPr>
             <w:rFonts w:ascii="Arial" w:hAnsi="Arial" w:cs="Arial" w:eastAsia="Arial"/>
@@ -3510,26 +3604,26 @@
         <w:rPr>
           <w:rFonts w:ascii="Arial" w:hAnsi="Arial" w:cs="Arial" w:eastAsia="Arial"/>
           <w:b/>
-          <w:color w:val="B7791F"/>
-          <w:sz w:val="36"/>
-        </w:rPr>
-        <w:t xml:space="preserve">L07-A5 — explainer_demo/creator_long / horizontal  ·  PENDING CAPTIONS — YOUTUBE BLOCKED THIS RUN</w:t>
-      </w:r>
-    </w:p>
-    <w:p>
-      <w:pPr>
-        <w:spacing w:lineRule="auto" w:line="276" w:before="0" w:after="0"/>
-      </w:pPr>
-      <w:r>
-        <w:rPr>
-          <w:rFonts w:ascii="Arial" w:hAnsi="Arial" w:cs="Arial" w:eastAsia="Arial"/>
-          <w:b w:val="0"/>
-          <w:color w:val="B7791F"/>
-          <w:sz w:val="36"/>
-        </w:rPr>
-        <w:t xml:space="preserve">Top candidate:  </w:t>
-      </w:r>
-      <w:hyperlink r:id="rIdClip6">
+          <w:color w:val="1155CC"/>
+          <w:sz w:val="36"/>
+        </w:rPr>
+        <w:t xml:space="preserve">L07-A5 — explainer_demo/creator_long / horizontal</w:t>
+      </w:r>
+    </w:p>
+    <w:p>
+      <w:pPr>
+        <w:spacing w:lineRule="auto" w:line="276" w:before="0" w:after="0"/>
+      </w:pPr>
+      <w:r>
+        <w:rPr>
+          <w:rFonts w:ascii="Arial" w:hAnsi="Arial" w:cs="Arial" w:eastAsia="Arial"/>
+          <w:b w:val="0"/>
+          <w:color w:val="1155CC"/>
+          <w:sz w:val="36"/>
+        </w:rPr>
+        <w:t xml:space="preserve">We Had 400 People Shop For Groceries. What We Found Will Shock You. (More Perfect Union / Consumer Reports)  —  </w:t>
+      </w:r>
+      <w:hyperlink r:id="rIdClip5">
         <w:r>
           <w:rPr>
             <w:rFonts w:ascii="Arial" w:hAnsi="Arial" w:cs="Arial" w:eastAsia="Arial"/>
@@ -3549,11 +3643,34 @@
       <w:r>
         <w:rPr>
           <w:rFonts w:ascii="Arial" w:hAnsi="Arial" w:cs="Arial" w:eastAsia="Arial"/>
+          <w:b/>
+          <w:color w:val="1155CC"/>
+          <w:sz w:val="36"/>
+        </w:rPr>
+        <w:t xml:space="preserve">IN 4:05 – OUT 4:53</w:t>
+      </w:r>
+      <w:r>
+        <w:rPr>
+          <w:rFonts w:ascii="Arial" w:hAnsi="Arial" w:cs="Arial" w:eastAsia="Arial"/>
+          <w:b w:val="0"/>
+          <w:color w:val="1155CC"/>
+          <w:sz w:val="36"/>
+        </w:rPr>
+        <w:t xml:space="preserve">   OUTCUE: “Wait, what?”</w:t>
+      </w:r>
+    </w:p>
+    <w:p>
+      <w:pPr>
+        <w:spacing w:lineRule="auto" w:line="276" w:before="0" w:after="0"/>
+      </w:pPr>
+      <w:r>
+        <w:rPr>
+          <w:rFonts w:ascii="Arial" w:hAnsi="Arial" w:cs="Arial" w:eastAsia="Arial"/>
           <w:b w:val="0"/>
           <w:color w:val="B7791F"/>
           <w:sz w:val="36"/>
         </w:rPr>
-        <w:t xml:space="preserve">Not flagged: no transcript means no verifiable outcue. Re-run captions to get IN/OUT. No timecode invented.</w:t>
+        <w:t xml:space="preserve">NOTE: 18-minute source: the pull is 4:05-4:53; the pilot test earlier uses different egg numbers — don't extend the in-point back into it</w:t>
       </w:r>
     </w:p>
     <w:p>
@@ -6067,7 +6184,7 @@
         </w:rPr>
         <w:t xml:space="preserve">Katelyn Montalbano (@kb.montalbano) — Prime Day cart video, July 16, 2024  —  </w:t>
       </w:r>
-      <w:hyperlink r:id="rIdClip7">
+      <w:hyperlink r:id="rIdClip6">
         <w:r>
           <w:rPr>
             <w:rFonts w:ascii="Arial" w:hAnsi="Arial" w:cs="Arial" w:eastAsia="Arial"/>
@@ -6438,7 +6555,7 @@
         </w:rPr>
         <w:t xml:space="preserve">Jaymes (@jaymes.png, formerly @semyajnotsemaj) — 'WATCH OUT FOR SCAMS ON AMAZON!', July 16, 2024  —  </w:t>
       </w:r>
-      <w:hyperlink r:id="rIdClip8">
+      <w:hyperlink r:id="rIdClip7">
         <w:r>
           <w:rPr>
             <w:rFonts w:ascii="Arial" w:hAnsi="Arial" w:cs="Arial" w:eastAsia="Arial"/>

</xml_diff>